<commit_message>
Ruta 2: responsable del recorrido, Óscar Díaz José
Co-Authored-By: Claude Opus 5.5 <noreply@anthropic.com>
</commit_message>
<xml_diff>
--- a/itinerarios/2026-ruta-2-itinerario.docx
+++ b/itinerarios/2026-ruta-2-itinerario.docx
@@ -211,7 +211,7 @@
           <w:color w:val="1B2333"/>
           <w:sz w:val="20"/>
         </w:rPr>
-        <w:t>Itinerario: Dr. José Gervasio Partida Sedas</w:t>
+        <w:t>Responsable del recorrido: Óscar Díaz José · Itinerario: Dr. José Gervasio Partida Sedas</w:t>
       </w:r>
     </w:p>
     <w:tbl>
@@ -4781,7 +4781,7 @@
           <w:color w:val="1B2333"/>
           <w:sz w:val="20"/>
         </w:rPr>
-        <w:t>Autor de la guía: Dr. Héctor Tecumshé Mojica Zárate, Universidad Autónoma Chapingo · Centro Académico Regional Huatusco. Itinerario: Dr. José Gervasio Partida Sedas.</w:t>
+        <w:t>Autor de la guía: Dr. Héctor Tecumshé Mojica Zárate, Universidad Autónoma Chapingo · Centro Académico Regional Huatusco. Responsable del recorrido: Óscar Díaz José. Itinerario: Dr. José Gervasio Partida Sedas.</w:t>
       </w:r>
     </w:p>
     <w:p>

</xml_diff>

<commit_message>
Ruta 1 versión 1.1.1 (DOI 10.5281/zenodo.23642683) y Óscar Díaz José como autor; Ruta 2 con los autores de la Ruta 1
Co-Authored-By: Claude Opus 5.5 <noreply@anthropic.com>
</commit_message>
<xml_diff>
--- a/itinerarios/2026-ruta-2-itinerario.docx
+++ b/itinerarios/2026-ruta-2-itinerario.docx
@@ -196,7 +196,7 @@
           <w:color w:val="1B2333"/>
           <w:sz w:val="20"/>
         </w:rPr>
-        <w:t>Guía elaborada por Dr. Héctor Tecumshé Mojica Zárate · Universidad Autónoma Chapingo · Centro Académico Regional Huatusco</w:t>
+        <w:t>Guía elaborada por Héctor Tecumshé Mojica Zárate, José Gervasio Partida Sedas, Sergio Alejo Bello, José Orlando Rojas Reyes y Óscar Díaz José · Universidad Autónoma Chapingo · Centro Académico Regional Huatusco</w:t>
       </w:r>
     </w:p>
     <w:p>
@@ -4781,7 +4781,7 @@
           <w:color w:val="1B2333"/>
           <w:sz w:val="20"/>
         </w:rPr>
-        <w:t>Autor de la guía: Dr. Héctor Tecumshé Mojica Zárate, Universidad Autónoma Chapingo · Centro Académico Regional Huatusco. Facilitador del recorrido: Óscar Díaz José. Itinerario: Dr. José Gervasio Partida Sedas.</w:t>
+        <w:t>Autores de la guía: Héctor Tecumshé Mojica Zárate, José Gervasio Partida Sedas, Sergio Alejo Bello, José Orlando Rojas Reyes y Óscar Díaz José. Universidad Autónoma Chapingo · Centro Académico Regional Huatusco. Facilitador del recorrido: Óscar Díaz José. Itinerario: Dr. José Gervasio Partida Sedas.</w:t>
       </w:r>
     </w:p>
     <w:p>
@@ -4811,7 +4811,7 @@
           <w:color w:val="1B2333"/>
           <w:sz w:val="20"/>
         </w:rPr>
-        <w:t>Mojica-Zárate, H. T. (2026). Ruta de Altura: guía de campo para celular del recorrido SOMEXA 2026, Ruta 2, frutales de montaña y agroecología en las faldas del Citlaltépetl (Versión 1.0.0) [Software]. Zenodo. https://doi.org/10.5281/zenodo.23642554</w:t>
+        <w:t>Mojica-Zárate, H. T., Partida-Sedas, J. G., Alejo-Bello, S., Rojas-Reyes, J. O., y Díaz-José, Ó. (2026). Ruta de Altura: guía de campo para celular del recorrido SOMEXA 2026, Ruta 2, frutales de montaña y agroecología en las faldas del Citlaltépetl (Versión 1.0.0) [Software]. Zenodo. https://doi.org/10.5281/zenodo.23642554</w:t>
       </w:r>
     </w:p>
     <w:sectPr>

</xml_diff>

<commit_message>
Ruta 2 versión 1.0.1 (DOI 10.5281/zenodo.23642837): Óscar Díaz José como tercer autor
Co-Authored-By: Claude Opus 5.5 <noreply@anthropic.com>
</commit_message>
<xml_diff>
--- a/itinerarios/2026-ruta-2-itinerario.docx
+++ b/itinerarios/2026-ruta-2-itinerario.docx
@@ -196,7 +196,7 @@
           <w:color w:val="1B2333"/>
           <w:sz w:val="20"/>
         </w:rPr>
-        <w:t>Guía elaborada por Héctor Tecumshé Mojica Zárate, José Gervasio Partida Sedas, Sergio Alejo Bello, José Orlando Rojas Reyes y Óscar Díaz José · Universidad Autónoma Chapingo · Centro Académico Regional Huatusco</w:t>
+        <w:t>Guía elaborada por Héctor Tecumshé Mojica Zárate, José Gervasio Partida Sedas, Óscar Díaz José, Sergio Alejo Bello y José Orlando Rojas Reyes · Universidad Autónoma Chapingo · Centro Académico Regional Huatusco</w:t>
       </w:r>
     </w:p>
     <w:p>
@@ -4781,7 +4781,7 @@
           <w:color w:val="1B2333"/>
           <w:sz w:val="20"/>
         </w:rPr>
-        <w:t>Autores de la guía: Héctor Tecumshé Mojica Zárate, José Gervasio Partida Sedas, Sergio Alejo Bello, José Orlando Rojas Reyes y Óscar Díaz José. Universidad Autónoma Chapingo · Centro Académico Regional Huatusco. Facilitador del recorrido: Óscar Díaz José. Itinerario: Dr. José Gervasio Partida Sedas.</w:t>
+        <w:t>Autores de la guía: Héctor Tecumshé Mojica Zárate, José Gervasio Partida Sedas, Óscar Díaz José, Sergio Alejo Bello y José Orlando Rojas Reyes. Universidad Autónoma Chapingo · Centro Académico Regional Huatusco. Facilitador del recorrido: Óscar Díaz José. Itinerario: Dr. José Gervasio Partida Sedas.</w:t>
       </w:r>
     </w:p>
     <w:p>
@@ -4811,7 +4811,7 @@
           <w:color w:val="1B2333"/>
           <w:sz w:val="20"/>
         </w:rPr>
-        <w:t>Mojica-Zárate, H. T., Partida-Sedas, J. G., Alejo-Bello, S., Rojas-Reyes, J. O., y Díaz-José, Ó. (2026). Ruta de Altura: guía de campo para celular del recorrido SOMEXA 2026, Ruta 2, frutales de montaña y agroecología en las faldas del Citlaltépetl (Versión 1.0.0) [Software]. Zenodo. https://doi.org/10.5281/zenodo.23642554</w:t>
+        <w:t>Mojica-Zárate, H. T., Partida-Sedas, J. G., Díaz-José, Ó., Alejo-Bello, S., y Rojas-Reyes, J. O. (2026). Ruta de Altura: guía de campo para celular del recorrido SOMEXA 2026, Ruta 2, frutales de montaña y agroecología en las faldas del Citlaltépetl (Versión 1.0.1) [Software]. Zenodo. https://doi.org/10.5281/zenodo.23642837</w:t>
       </w:r>
     </w:p>
     <w:sectPr>

</xml_diff>

<commit_message>
Ruta 2: lema del congreso en la portada y en el itinerario
Co-Authored-By: Claude Opus 5.5 <noreply@anthropic.com>
</commit_message>
<xml_diff>
--- a/itinerarios/2026-ruta-2-itinerario.docx
+++ b/itinerarios/2026-ruta-2-itinerario.docx
@@ -119,6 +119,16 @@
                 <w:sz w:val="21"/>
               </w:rPr>
               <w:t>Salida de campo · Ruta 2</w:t>
+            </w:r>
+          </w:p>
+          <w:p>
+            <w:r>
+              <w:rPr>
+                <w:i/>
+                <w:color w:val="A8741A"/>
+                <w:sz w:val="20"/>
+              </w:rPr>
+              <w:t>«Ciencia y saber campesino para construir soberanía alimentaria y energética»</w:t>
             </w:r>
           </w:p>
         </w:tc>

</xml_diff>